<commit_message>
Resume: Network Security Engineer - Palo Alto Prisma Access @ Unknown (unknown)
</commit_message>
<xml_diff>
--- a/resumes/Resume_Network_Security_Engineer_-_Palo_Al_Unknown__unknown_.docx
+++ b/resumes/Resume_Network_Security_Engineer_-_Palo_Al_Unknown__unknown_.docx
@@ -430,7 +430,7 @@
           <w:sz w:val="19"/>
           <w:szCs w:val="19"/>
         </w:rPr>
-        <w:t>Triaged 50+ weekly inventory reimbursement cases by severity and policy eligibility, translating high-volume case review into access governance mindset and exception documentation.</w:t>
+        <w:t>Triaged 50+ weekly inventory reimbursement cases by severity and policy eligibility, translating high-volume case review into structured investigation, escalation, and evidence documentation.</w:t>
       </w:r>
     </w:p>
     <w:p>
@@ -449,7 +449,7 @@
           <w:sz w:val="19"/>
           <w:szCs w:val="19"/>
         </w:rPr>
-        <w:t>Investigated seller claims, identifying policy violations and anomalous patterns, escalating findings to senior reviewers</w:t>
+        <w:t>Conducted root cause analysis on seller claims, identifying policy violations and anomalous patterns for pattern review and investigation handoffs.</w:t>
       </w:r>
     </w:p>
     <w:p>
@@ -588,7 +588,7 @@
           <w:sz w:val="19"/>
           <w:szCs w:val="19"/>
         </w:rPr>
-        <w:t>Deployed Splunk SIEM with SPL correlation (detection engineering) searches for brute-force detection and lateral movement, mapped TTPs to MITRE ATT&amp;CK (TTP mapping).</w:t>
+        <w:t>Deployed Splunk SIEM with SPL correlation searches for brute-force detection, lateral movement, and privilege escalation; mapped TTPs to MITRE ATT&amp;CK and wrote PICERL incident report for FIRST.org.</w:t>
       </w:r>
     </w:p>
     <w:p>
@@ -607,7 +607,7 @@
           <w:sz w:val="19"/>
           <w:szCs w:val="19"/>
         </w:rPr>
-        <w:t>Built automated SOAR (security orchestration and automation)-style detection pipeline using Python, ingesting Splunk alerts, running IOC enrichment (threat intelligence) via VirusTotal API, and dispatching Telegram notifications with severity classification.</w:t>
+        <w:t>Developed SOAR-style detection pipeline using Python, ingesting Splunk alerts, enriching with VirusTotal API, and dispatching Telegram notifications with severity classification.</w:t>
       </w:r>
     </w:p>
     <w:p>
@@ -626,7 +626,7 @@
           <w:sz w:val="19"/>
           <w:szCs w:val="19"/>
         </w:rPr>
-        <w:t>Converted detection logic to Sigma rules (detection-as-code) and performed TCP/IP analysis in Wireshark to detect SYN scans, DNS tunnelling, and plaintext credential exposure on unencrypted sessions.</w:t>
+        <w:t>Converted detection logic to Sigma rules (detection-as-code) (vendor-neutral format used by enterprise SOCs); performed TCP/IP analysis in Wireshark to detect SYN scans, DNS tunnelling, and plaintext credential exposure on unencrypted sessions.</w:t>
       </w:r>
     </w:p>
     <w:p>
@@ -697,7 +697,7 @@
           <w:sz w:val="19"/>
           <w:szCs w:val="19"/>
         </w:rPr>
-        <w:t>Built automated vulnerability assessment pipeline integrating Nessus and OpenVAS REST APIs in Python, generating CVE reports classified by CVSS severity (vulnerability prioritisation).</w:t>
+        <w:t>Developed automated vulnerability assessment pipeline integrating Nessus and OpenVAS REST APIs in Python, generating CVE reports with CVSS severity and EPSS context from FIRST.org API.</w:t>
       </w:r>
     </w:p>
     <w:p>
@@ -716,7 +716,7 @@
           <w:sz w:val="19"/>
           <w:szCs w:val="19"/>
         </w:rPr>
-        <w:t>Developed OWASP Top 10 (web application security) automated web checker that sends crafted HTTP requests to detect injection, broken auth, and SSRF vulnerabilities, documenting SQL injection exploit and parameterised query remediation.</w:t>
+        <w:t>Developed OWASP Top 10 (web application security) automated web checker that sends crafted HTTP requests to detect injection, broken auth, and SSRF vulnerabilities; documented SQL injection exploit and parameterised query remediation.</w:t>
       </w:r>
     </w:p>
     <w:p>
@@ -735,7 +735,7 @@
           <w:sz w:val="19"/>
           <w:szCs w:val="19"/>
         </w:rPr>
-        <w:t>Automated scan scheduling via Bash and cron, building delta-scan logic to flag newly discovered CVEs and organizing patch compliance (remediation tracking) tracking evidence.</w:t>
+        <w:t>Automated scan scheduling via Bash and cron; built delta-scan logic to flag newly discovered CVEs and organize patch compliance (remediation tracking) tracking evidence.</w:t>
       </w:r>
     </w:p>
     <w:p>
@@ -784,15 +784,15 @@
           <w:sz w:val="19"/>
           <w:szCs w:val="19"/>
         </w:rPr>
-        <w:t xml:space="preserve">Network Security: </w:t>
-      </w:r>
-      <w:r>
-        <w:rPr>
-          <w:rFonts w:ascii="Source Sans Pro" w:eastAsia="Source Sans Pro" w:hAnsi="Source Sans Pro" w:cs="Source Sans Pro"/>
-          <w:sz w:val="19"/>
-          <w:szCs w:val="19"/>
-        </w:rPr>
-        <w:t>Splunk, Wireshark, Nmap</w:t>
+        <w:t xml:space="preserve">SOC Operations: </w:t>
+      </w:r>
+      <w:r>
+        <w:rPr>
+          <w:rFonts w:ascii="Source Sans Pro" w:eastAsia="Source Sans Pro" w:hAnsi="Source Sans Pro" w:cs="Source Sans Pro"/>
+          <w:sz w:val="19"/>
+          <w:szCs w:val="19"/>
+        </w:rPr>
+        <w:t>Alert triage, incident investigation, log analysis, threat detection, escalation, false positive analysis</w:t>
       </w:r>
     </w:p>
     <w:p>
@@ -806,15 +806,15 @@
           <w:sz w:val="19"/>
           <w:szCs w:val="19"/>
         </w:rPr>
-        <w:t xml:space="preserve">Threat Detection: </w:t>
-      </w:r>
-      <w:r>
-        <w:rPr>
-          <w:rFonts w:ascii="Source Sans Pro" w:eastAsia="Source Sans Pro" w:hAnsi="Source Sans Pro" w:cs="Source Sans Pro"/>
-          <w:sz w:val="19"/>
-          <w:szCs w:val="19"/>
-        </w:rPr>
-        <w:t>MITRE ATT&amp;CK, Sigma rules, VirusTotal API</w:t>
+        <w:t xml:space="preserve">SIEM &amp; Monitoring: </w:t>
+      </w:r>
+      <w:r>
+        <w:rPr>
+          <w:rFonts w:ascii="Source Sans Pro" w:eastAsia="Source Sans Pro" w:hAnsi="Source Sans Pro" w:cs="Source Sans Pro"/>
+          <w:sz w:val="19"/>
+          <w:szCs w:val="19"/>
+        </w:rPr>
+        <w:t>Splunk (SPL), Elastic SIEM (basic), Windows Event Logs, Sysmon, Wireshark</w:t>
       </w:r>
     </w:p>
     <w:p>
@@ -828,15 +828,15 @@
           <w:sz w:val="19"/>
           <w:szCs w:val="19"/>
         </w:rPr>
-        <w:t xml:space="preserve">Vulnerability Assessment: </w:t>
-      </w:r>
-      <w:r>
-        <w:rPr>
-          <w:rFonts w:ascii="Source Sans Pro" w:eastAsia="Source Sans Pro" w:hAnsi="Source Sans Pro" w:cs="Source Sans Pro"/>
-          <w:sz w:val="19"/>
-          <w:szCs w:val="19"/>
-        </w:rPr>
-        <w:t>Nessus, OpenVAS, CVSS, EPSS</w:t>
+        <w:t xml:space="preserve">Threat Intelligence: </w:t>
+      </w:r>
+      <w:r>
+        <w:rPr>
+          <w:rFonts w:ascii="Source Sans Pro" w:eastAsia="Source Sans Pro" w:hAnsi="Source Sans Pro" w:cs="Source Sans Pro"/>
+          <w:sz w:val="19"/>
+          <w:szCs w:val="19"/>
+        </w:rPr>
+        <w:t>MITRE ATT&amp;CK, IOC analysis, VirusTotal, OSINT enrichment, Cyber Kill Chain</w:t>
       </w:r>
     </w:p>
     <w:p>
@@ -850,6 +850,28 @@
           <w:sz w:val="19"/>
           <w:szCs w:val="19"/>
         </w:rPr>
+        <w:t xml:space="preserve">Systems &amp; Networking: </w:t>
+      </w:r>
+      <w:r>
+        <w:rPr>
+          <w:rFonts w:ascii="Source Sans Pro" w:eastAsia="Source Sans Pro" w:hAnsi="Source Sans Pro" w:cs="Source Sans Pro"/>
+          <w:sz w:val="19"/>
+          <w:szCs w:val="19"/>
+        </w:rPr>
+        <w:t>Windows internals, Linux fundamentals, TCP/IP, DNS, HTTP/S, firewall and IDS/IPS concepts</w:t>
+      </w:r>
+    </w:p>
+    <w:p>
+      <w:pPr>
+        <w:spacing w:before="29" w:after="29"/>
+      </w:pPr>
+      <w:r>
+        <w:rPr>
+          <w:rFonts w:ascii="Source Sans Pro" w:eastAsia="Source Sans Pro" w:hAnsi="Source Sans Pro" w:cs="Source Sans Pro"/>
+          <w:b/>
+          <w:sz w:val="19"/>
+          <w:szCs w:val="19"/>
+        </w:rPr>
         <w:t xml:space="preserve">Automation: </w:t>
       </w:r>
       <w:r>
@@ -858,29 +880,7 @@
           <w:sz w:val="19"/>
           <w:szCs w:val="19"/>
         </w:rPr>
-        <w:t>Python, Bash, SOC Automation</w:t>
-      </w:r>
-    </w:p>
-    <w:p>
-      <w:pPr>
-        <w:spacing w:before="29" w:after="29"/>
-      </w:pPr>
-      <w:r>
-        <w:rPr>
-          <w:rFonts w:ascii="Source Sans Pro" w:eastAsia="Source Sans Pro" w:hAnsi="Source Sans Pro" w:cs="Source Sans Pro"/>
-          <w:b/>
-          <w:sz w:val="19"/>
-          <w:szCs w:val="19"/>
-        </w:rPr>
-        <w:t xml:space="preserve">Incident Response: </w:t>
-      </w:r>
-      <w:r>
-        <w:rPr>
-          <w:rFonts w:ascii="Source Sans Pro" w:eastAsia="Source Sans Pro" w:hAnsi="Source Sans Pro" w:cs="Source Sans Pro"/>
-          <w:sz w:val="19"/>
-          <w:szCs w:val="19"/>
-        </w:rPr>
-        <w:t>Python, Bash (basic), regular expressions, linux</w:t>
+        <w:t>Python, Bash (basic), regular expressions, security, access, owasp, cve</w:t>
       </w:r>
     </w:p>
     <w:p>

</xml_diff>